<commit_message>
new file:   .gitignore new file:   .python-version modified:   Example/Example_A.docx modified:   Example/Example_B.docx modified:   Example/Example_C.docx new file:   Example/Example_D.docx new file:   Example/Example_E.docx new file:   Example/Example_F.docx modified:   Example/Example_key.csv new file:   pyproject.toml new file:   uv.lock
</commit_message>
<xml_diff>
--- a/Example/Example_A.docx
+++ b/Example/Example_A.docx
@@ -964,7 +964,7 @@
           <w:sz w:val="22"/>
           <w:szCs w:val="22"/>
         </w:rPr>
-        <w:t>A.  1000 MW</w:t>
+        <w:t>A.  500 MW</w:t>
       </w:r>
     </w:p>
     <w:p>
@@ -983,7 +983,7 @@
           <w:sz w:val="22"/>
           <w:szCs w:val="22"/>
         </w:rPr>
-        <w:t>B.  500 MW</w:t>
+        <w:t>B.  1500 MW</w:t>
       </w:r>
     </w:p>
     <w:p>
@@ -1002,7 +1002,7 @@
           <w:sz w:val="22"/>
           <w:szCs w:val="22"/>
         </w:rPr>
-        <w:t>C.  1500 MW</w:t>
+        <w:t>C.  1000 MW</w:t>
       </w:r>
     </w:p>
     <w:p>
@@ -1301,6 +1301,126 @@
           <w:szCs w:val="22"/>
         </w:rPr>
         <w:t>B.  </w:t>
+      </w:r>
+      <m:oMath>
+        <m:r>
+          <w:rPr>
+            <w:rFonts w:ascii="Cambria Math" w:cs="Arial" w:hAnsi="Cambria Math"/>
+            <w:sz w:val="22"/>
+            <w:szCs w:val="22"/>
+          </w:rPr>
+          <m:t>2 </m:t>
+        </m:r>
+        <m:sSub>
+          <m:sSubPr>
+            <m:ctrlPr>
+              <w:rPr>
+                <w:rFonts w:ascii="Cambria Math" w:cs="Arial" w:hAnsi="Cambria Math"/>
+                <w:sz w:val="22"/>
+                <w:szCs w:val="22"/>
+              </w:rPr>
+            </m:ctrlPr>
+          </m:sSubPr>
+          <m:e>
+            <m:r>
+              <w:rPr>
+                <w:rFonts w:ascii="Cambria Math" w:cs="Arial" w:hAnsi="Cambria Math"/>
+                <w:sz w:val="22"/>
+                <w:szCs w:val="22"/>
+              </w:rPr>
+              <m:t>l</m:t>
+            </m:r>
+          </m:e>
+          <m:sub>
+            <m:r>
+              <w:rPr>
+                <w:rFonts w:ascii="Cambria Math" w:cs="Arial" w:hAnsi="Cambria Math"/>
+                <w:sz w:val="22"/>
+                <w:szCs w:val="22"/>
+              </w:rPr>
+              <m:t>0</m:t>
+            </m:r>
+          </m:sub>
+        </m:sSub>
+      </m:oMath>
+      <w:r>
+        <w:rPr>
+          <w:rFonts w:ascii="Arial" w:cs="Arial" w:hAnsi="Arial"/>
+          <w:sz w:val="22"/>
+          <w:szCs w:val="22"/>
+        </w:rPr>
+        <w:t> </w:t>
+      </w:r>
+    </w:p>
+    <w:p>
+      <w:pPr>
+        <w:pStyle w:val="BodyText"/>
+        <w:ind w:hanging="360" w:left="720"/>
+        <w:rPr>
+          <w:rFonts w:ascii="Arial" w:cs="Arial" w:hAnsi="Arial"/>
+          <w:sz w:val="22"/>
+          <w:szCs w:val="22"/>
+        </w:rPr>
+      </w:pPr>
+      <w:r>
+        <w:rPr>
+          <w:rFonts w:ascii="Arial" w:cs="Arial" w:hAnsi="Arial"/>
+          <w:sz w:val="22"/>
+          <w:szCs w:val="22"/>
+        </w:rPr>
+        <w:t>C.  </w:t>
+      </w:r>
+      <m:oMath>
+        <m:sSub>
+          <m:sSubPr>
+            <m:ctrlPr>
+              <w:rPr>
+                <w:rFonts w:ascii="Cambria Math" w:cs="Arial" w:hAnsi="Cambria Math"/>
+                <w:sz w:val="22"/>
+                <w:szCs w:val="22"/>
+              </w:rPr>
+            </m:ctrlPr>
+          </m:sSubPr>
+          <m:e>
+            <m:r>
+              <w:rPr>
+                <w:rFonts w:ascii="Cambria Math" w:cs="Arial" w:hAnsi="Cambria Math"/>
+                <w:sz w:val="22"/>
+                <w:szCs w:val="22"/>
+              </w:rPr>
+              <m:t>l</m:t>
+            </m:r>
+          </m:e>
+          <m:sub>
+            <m:r>
+              <w:rPr>
+                <w:rFonts w:ascii="Cambria Math" w:cs="Arial" w:hAnsi="Cambria Math"/>
+                <w:sz w:val="22"/>
+                <w:szCs w:val="22"/>
+              </w:rPr>
+              <m:t>0</m:t>
+            </m:r>
+          </m:sub>
+        </m:sSub>
+      </m:oMath>
+    </w:p>
+    <w:p>
+      <w:pPr>
+        <w:pStyle w:val="BodyText"/>
+        <w:ind w:hanging="360" w:left="720"/>
+        <w:rPr>
+          <w:rFonts w:ascii="Arial" w:cs="Arial" w:hAnsi="Arial"/>
+          <w:sz w:val="22"/>
+          <w:szCs w:val="22"/>
+        </w:rPr>
+      </w:pPr>
+      <w:r>
+        <w:rPr>
+          <w:rFonts w:ascii="Arial" w:cs="Arial" w:hAnsi="Arial"/>
+          <w:sz w:val="22"/>
+          <w:szCs w:val="22"/>
+        </w:rPr>
+        <w:t>D.  </w:t>
       </w:r>
       <m:oMath>
         <m:f>
@@ -1358,126 +1478,6 @@
           </m:den>
         </m:f>
       </m:oMath>
-    </w:p>
-    <w:p>
-      <w:pPr>
-        <w:pStyle w:val="BodyText"/>
-        <w:ind w:hanging="360" w:left="720"/>
-        <w:rPr>
-          <w:rFonts w:ascii="Arial" w:cs="Arial" w:hAnsi="Arial"/>
-          <w:sz w:val="22"/>
-          <w:szCs w:val="22"/>
-        </w:rPr>
-      </w:pPr>
-      <w:r>
-        <w:rPr>
-          <w:rFonts w:ascii="Arial" w:cs="Arial" w:hAnsi="Arial"/>
-          <w:sz w:val="22"/>
-          <w:szCs w:val="22"/>
-        </w:rPr>
-        <w:t>C.  </w:t>
-      </w:r>
-      <m:oMath>
-        <m:sSub>
-          <m:sSubPr>
-            <m:ctrlPr>
-              <w:rPr>
-                <w:rFonts w:ascii="Cambria Math" w:cs="Arial" w:hAnsi="Cambria Math"/>
-                <w:sz w:val="22"/>
-                <w:szCs w:val="22"/>
-              </w:rPr>
-            </m:ctrlPr>
-          </m:sSubPr>
-          <m:e>
-            <m:r>
-              <w:rPr>
-                <w:rFonts w:ascii="Cambria Math" w:cs="Arial" w:hAnsi="Cambria Math"/>
-                <w:sz w:val="22"/>
-                <w:szCs w:val="22"/>
-              </w:rPr>
-              <m:t>l</m:t>
-            </m:r>
-          </m:e>
-          <m:sub>
-            <m:r>
-              <w:rPr>
-                <w:rFonts w:ascii="Cambria Math" w:cs="Arial" w:hAnsi="Cambria Math"/>
-                <w:sz w:val="22"/>
-                <w:szCs w:val="22"/>
-              </w:rPr>
-              <m:t>0</m:t>
-            </m:r>
-          </m:sub>
-        </m:sSub>
-      </m:oMath>
-    </w:p>
-    <w:p>
-      <w:pPr>
-        <w:pStyle w:val="BodyText"/>
-        <w:ind w:hanging="360" w:left="720"/>
-        <w:rPr>
-          <w:rFonts w:ascii="Arial" w:cs="Arial" w:hAnsi="Arial"/>
-          <w:sz w:val="22"/>
-          <w:szCs w:val="22"/>
-        </w:rPr>
-      </w:pPr>
-      <w:r>
-        <w:rPr>
-          <w:rFonts w:ascii="Arial" w:cs="Arial" w:hAnsi="Arial"/>
-          <w:sz w:val="22"/>
-          <w:szCs w:val="22"/>
-        </w:rPr>
-        <w:t>D.  </w:t>
-      </w:r>
-      <m:oMath>
-        <m:r>
-          <w:rPr>
-            <w:rFonts w:ascii="Cambria Math" w:cs="Arial" w:hAnsi="Cambria Math"/>
-            <w:sz w:val="22"/>
-            <w:szCs w:val="22"/>
-          </w:rPr>
-          <m:t>2 </m:t>
-        </m:r>
-        <m:sSub>
-          <m:sSubPr>
-            <m:ctrlPr>
-              <w:rPr>
-                <w:rFonts w:ascii="Cambria Math" w:cs="Arial" w:hAnsi="Cambria Math"/>
-                <w:sz w:val="22"/>
-                <w:szCs w:val="22"/>
-              </w:rPr>
-            </m:ctrlPr>
-          </m:sSubPr>
-          <m:e>
-            <m:r>
-              <w:rPr>
-                <w:rFonts w:ascii="Cambria Math" w:cs="Arial" w:hAnsi="Cambria Math"/>
-                <w:sz w:val="22"/>
-                <w:szCs w:val="22"/>
-              </w:rPr>
-              <m:t>l</m:t>
-            </m:r>
-          </m:e>
-          <m:sub>
-            <m:r>
-              <w:rPr>
-                <w:rFonts w:ascii="Cambria Math" w:cs="Arial" w:hAnsi="Cambria Math"/>
-                <w:sz w:val="22"/>
-                <w:szCs w:val="22"/>
-              </w:rPr>
-              <m:t>0</m:t>
-            </m:r>
-          </m:sub>
-        </m:sSub>
-      </m:oMath>
-      <w:r>
-        <w:rPr>
-          <w:rFonts w:ascii="Arial" w:cs="Arial" w:hAnsi="Arial"/>
-          <w:sz w:val="22"/>
-          <w:szCs w:val="22"/>
-        </w:rPr>
-        <w:t> </w:t>
-      </w:r>
     </w:p>
     <w:p>
       <w:pPr>

</xml_diff>